<commit_message>
1 to part 14 completed
</commit_message>
<xml_diff>
--- a/Banking_Application_Questions.docx
+++ b/Banking_Application_Questions.docx
@@ -3077,6 +3077,9 @@
         <w:t xml:space="preserve"> </w:t>
       </w:r>
       <w:r>
+        <w:rPr>
+          <w:noProof/>
+        </w:rPr>
         <w:lastRenderedPageBreak/>
         <w:drawing>
           <wp:inline distT="0" distB="0" distL="0" distR="0" wp14:anchorId="0580DBA0" wp14:editId="529784B7">
@@ -3133,6 +3136,9 @@
         <w:t xml:space="preserve"> </w:t>
       </w:r>
       <w:r>
+        <w:rPr>
+          <w:noProof/>
+        </w:rPr>
         <w:drawing>
           <wp:inline distT="0" distB="0" distL="0" distR="0" wp14:anchorId="2122F012" wp14:editId="53313F7A">
             <wp:extent cx="5172797" cy="3743847"/>
@@ -3180,6 +3186,9 @@
         <w:t xml:space="preserve"> </w:t>
       </w:r>
       <w:r>
+        <w:rPr>
+          <w:noProof/>
+        </w:rPr>
         <w:lastRenderedPageBreak/>
         <w:drawing>
           <wp:inline distT="0" distB="0" distL="0" distR="0" wp14:anchorId="7F60D6F2" wp14:editId="22A04C95">
@@ -3228,6 +3237,9 @@
         <w:t xml:space="preserve"> </w:t>
       </w:r>
       <w:r>
+        <w:rPr>
+          <w:noProof/>
+        </w:rPr>
         <w:drawing>
           <wp:inline distT="0" distB="0" distL="0" distR="0" wp14:anchorId="6FFE59E7" wp14:editId="35139043">
             <wp:extent cx="3543795" cy="314369"/>
@@ -3266,16 +3278,51 @@
       </w:r>
       <w:r>
         <w:br/>
-        <w:t>66</w:t>
-      </w:r>
-      <w:bookmarkStart w:id="0" w:name="_GoBack"/>
-      <w:r>
-        <w:t>. How can the console menu call the Deposit and Withdraw methods?</w:t>
-      </w:r>
-      <w:r>
-        <w:br/>
-      </w:r>
-      <w:bookmarkEnd w:id="0"/>
+        <w:t>66. How can the console menu call the Deposit and Withdraw methods?</w:t>
+      </w:r>
+      <w:r>
+        <w:rPr>
+          <w:noProof/>
+        </w:rPr>
+        <w:t xml:space="preserve"> </w:t>
+      </w:r>
+      <w:r>
+        <w:drawing>
+          <wp:inline distT="0" distB="0" distL="0" distR="0" wp14:anchorId="325B3785" wp14:editId="625704EF">
+            <wp:extent cx="4505954" cy="3029373"/>
+            <wp:effectExtent l="0" t="0" r="9525" b="0"/>
+            <wp:docPr id="61" name="Picture 61"/>
+            <wp:cNvGraphicFramePr>
+              <a:graphicFrameLocks xmlns:a="http://schemas.openxmlformats.org/drawingml/2006/main" noChangeAspect="1"/>
+            </wp:cNvGraphicFramePr>
+            <a:graphic xmlns:a="http://schemas.openxmlformats.org/drawingml/2006/main">
+              <a:graphicData uri="http://schemas.openxmlformats.org/drawingml/2006/picture">
+                <pic:pic xmlns:pic="http://schemas.openxmlformats.org/drawingml/2006/picture">
+                  <pic:nvPicPr>
+                    <pic:cNvPr id="1" name=""/>
+                    <pic:cNvPicPr/>
+                  </pic:nvPicPr>
+                  <pic:blipFill>
+                    <a:blip r:embed="rId66"/>
+                    <a:stretch>
+                      <a:fillRect/>
+                    </a:stretch>
+                  </pic:blipFill>
+                  <pic:spPr>
+                    <a:xfrm>
+                      <a:off x="0" y="0"/>
+                      <a:ext cx="4505954" cy="3029373"/>
+                    </a:xfrm>
+                    <a:prstGeom prst="rect">
+                      <a:avLst/>
+                    </a:prstGeom>
+                  </pic:spPr>
+                </pic:pic>
+              </a:graphicData>
+            </a:graphic>
+          </wp:inline>
+        </w:drawing>
+      </w:r>
       <w:r>
         <w:br/>
         <w:t>Part 13 - Transaction History</w:t>
@@ -3285,22 +3332,238 @@
         <w:t>67. How can you store many transaction records?</w:t>
       </w:r>
       <w:r>
+        <w:rPr>
+          <w:noProof/>
+        </w:rPr>
+        <w:t xml:space="preserve"> </w:t>
+      </w:r>
+      <w:r>
+        <w:drawing>
+          <wp:inline distT="0" distB="0" distL="0" distR="0" wp14:anchorId="70DA66B1" wp14:editId="33A85114">
+            <wp:extent cx="4210638" cy="390580"/>
+            <wp:effectExtent l="0" t="0" r="0" b="9525"/>
+            <wp:docPr id="62" name="Picture 62"/>
+            <wp:cNvGraphicFramePr>
+              <a:graphicFrameLocks xmlns:a="http://schemas.openxmlformats.org/drawingml/2006/main" noChangeAspect="1"/>
+            </wp:cNvGraphicFramePr>
+            <a:graphic xmlns:a="http://schemas.openxmlformats.org/drawingml/2006/main">
+              <a:graphicData uri="http://schemas.openxmlformats.org/drawingml/2006/picture">
+                <pic:pic xmlns:pic="http://schemas.openxmlformats.org/drawingml/2006/picture">
+                  <pic:nvPicPr>
+                    <pic:cNvPr id="1" name=""/>
+                    <pic:cNvPicPr/>
+                  </pic:nvPicPr>
+                  <pic:blipFill>
+                    <a:blip r:embed="rId67"/>
+                    <a:stretch>
+                      <a:fillRect/>
+                    </a:stretch>
+                  </pic:blipFill>
+                  <pic:spPr>
+                    <a:xfrm>
+                      <a:off x="0" y="0"/>
+                      <a:ext cx="4210638" cy="390580"/>
+                    </a:xfrm>
+                    <a:prstGeom prst="rect">
+                      <a:avLst/>
+                    </a:prstGeom>
+                  </pic:spPr>
+                </pic:pic>
+              </a:graphicData>
+            </a:graphic>
+          </wp:inline>
+        </w:drawing>
+      </w:r>
+      <w:r>
         <w:br/>
         <w:t>68. How can you add a message when money is deposited?</w:t>
       </w:r>
       <w:r>
+        <w:rPr>
+          <w:noProof/>
+        </w:rPr>
+        <w:t xml:space="preserve"> </w:t>
+      </w:r>
+      <w:r>
+        <w:drawing>
+          <wp:inline distT="0" distB="0" distL="0" distR="0" wp14:anchorId="3C926600" wp14:editId="4B8B6005">
+            <wp:extent cx="3238952" cy="714475"/>
+            <wp:effectExtent l="0" t="0" r="0" b="9525"/>
+            <wp:docPr id="63" name="Picture 63"/>
+            <wp:cNvGraphicFramePr>
+              <a:graphicFrameLocks xmlns:a="http://schemas.openxmlformats.org/drawingml/2006/main" noChangeAspect="1"/>
+            </wp:cNvGraphicFramePr>
+            <a:graphic xmlns:a="http://schemas.openxmlformats.org/drawingml/2006/main">
+              <a:graphicData uri="http://schemas.openxmlformats.org/drawingml/2006/picture">
+                <pic:pic xmlns:pic="http://schemas.openxmlformats.org/drawingml/2006/picture">
+                  <pic:nvPicPr>
+                    <pic:cNvPr id="1" name=""/>
+                    <pic:cNvPicPr/>
+                  </pic:nvPicPr>
+                  <pic:blipFill>
+                    <a:blip r:embed="rId68"/>
+                    <a:stretch>
+                      <a:fillRect/>
+                    </a:stretch>
+                  </pic:blipFill>
+                  <pic:spPr>
+                    <a:xfrm>
+                      <a:off x="0" y="0"/>
+                      <a:ext cx="3238952" cy="714475"/>
+                    </a:xfrm>
+                    <a:prstGeom prst="rect">
+                      <a:avLst/>
+                    </a:prstGeom>
+                  </pic:spPr>
+                </pic:pic>
+              </a:graphicData>
+            </a:graphic>
+          </wp:inline>
+        </w:drawing>
+      </w:r>
+      <w:r>
         <w:br/>
         <w:t>69. How can you add a message when money is withdrawn?</w:t>
       </w:r>
       <w:r>
+        <w:rPr>
+          <w:noProof/>
+        </w:rPr>
+        <w:t xml:space="preserve"> </w:t>
+      </w:r>
+      <w:r>
+        <w:lastRenderedPageBreak/>
+        <w:drawing>
+          <wp:inline distT="0" distB="0" distL="0" distR="0" wp14:anchorId="3C390465" wp14:editId="75F37F87">
+            <wp:extent cx="3429479" cy="704948"/>
+            <wp:effectExtent l="0" t="0" r="0" b="0"/>
+            <wp:docPr id="64" name="Picture 64"/>
+            <wp:cNvGraphicFramePr>
+              <a:graphicFrameLocks xmlns:a="http://schemas.openxmlformats.org/drawingml/2006/main" noChangeAspect="1"/>
+            </wp:cNvGraphicFramePr>
+            <a:graphic xmlns:a="http://schemas.openxmlformats.org/drawingml/2006/main">
+              <a:graphicData uri="http://schemas.openxmlformats.org/drawingml/2006/picture">
+                <pic:pic xmlns:pic="http://schemas.openxmlformats.org/drawingml/2006/picture">
+                  <pic:nvPicPr>
+                    <pic:cNvPr id="1" name=""/>
+                    <pic:cNvPicPr/>
+                  </pic:nvPicPr>
+                  <pic:blipFill>
+                    <a:blip r:embed="rId69"/>
+                    <a:stretch>
+                      <a:fillRect/>
+                    </a:stretch>
+                  </pic:blipFill>
+                  <pic:spPr>
+                    <a:xfrm>
+                      <a:off x="0" y="0"/>
+                      <a:ext cx="3429479" cy="704948"/>
+                    </a:xfrm>
+                    <a:prstGeom prst="rect">
+                      <a:avLst/>
+                    </a:prstGeom>
+                  </pic:spPr>
+                </pic:pic>
+              </a:graphicData>
+            </a:graphic>
+          </wp:inline>
+        </w:drawing>
+      </w:r>
+      <w:r>
         <w:br/>
         <w:t>70. How can you show all transactions to the user?</w:t>
       </w:r>
       <w:r>
+        <w:rPr>
+          <w:noProof/>
+        </w:rPr>
+        <w:t xml:space="preserve"> </w:t>
+      </w:r>
+      <w:r>
+        <w:drawing>
+          <wp:inline distT="0" distB="0" distL="0" distR="0" wp14:anchorId="35F78DCB" wp14:editId="375A22A9">
+            <wp:extent cx="3924848" cy="2133898"/>
+            <wp:effectExtent l="0" t="0" r="0" b="0"/>
+            <wp:docPr id="65" name="Picture 65"/>
+            <wp:cNvGraphicFramePr>
+              <a:graphicFrameLocks xmlns:a="http://schemas.openxmlformats.org/drawingml/2006/main" noChangeAspect="1"/>
+            </wp:cNvGraphicFramePr>
+            <a:graphic xmlns:a="http://schemas.openxmlformats.org/drawingml/2006/main">
+              <a:graphicData uri="http://schemas.openxmlformats.org/drawingml/2006/picture">
+                <pic:pic xmlns:pic="http://schemas.openxmlformats.org/drawingml/2006/picture">
+                  <pic:nvPicPr>
+                    <pic:cNvPr id="1" name=""/>
+                    <pic:cNvPicPr/>
+                  </pic:nvPicPr>
+                  <pic:blipFill>
+                    <a:blip r:embed="rId70"/>
+                    <a:stretch>
+                      <a:fillRect/>
+                    </a:stretch>
+                  </pic:blipFill>
+                  <pic:spPr>
+                    <a:xfrm>
+                      <a:off x="0" y="0"/>
+                      <a:ext cx="3924848" cy="2133898"/>
+                    </a:xfrm>
+                    <a:prstGeom prst="rect">
+                      <a:avLst/>
+                    </a:prstGeom>
+                  </pic:spPr>
+                </pic:pic>
+              </a:graphicData>
+            </a:graphic>
+          </wp:inline>
+        </w:drawing>
+      </w:r>
+      <w:r>
         <w:br/>
         <w:t>71. What should be shown if there are no transactions yet?</w:t>
       </w:r>
       <w:r>
+        <w:rPr>
+          <w:noProof/>
+        </w:rPr>
+        <w:t xml:space="preserve"> </w:t>
+      </w:r>
+      <w:r>
+        <w:drawing>
+          <wp:inline distT="0" distB="0" distL="0" distR="0" wp14:anchorId="4BB69C29" wp14:editId="10270F2A">
+            <wp:extent cx="3924848" cy="790685"/>
+            <wp:effectExtent l="0" t="0" r="0" b="9525"/>
+            <wp:docPr id="66" name="Picture 66"/>
+            <wp:cNvGraphicFramePr>
+              <a:graphicFrameLocks xmlns:a="http://schemas.openxmlformats.org/drawingml/2006/main" noChangeAspect="1"/>
+            </wp:cNvGraphicFramePr>
+            <a:graphic xmlns:a="http://schemas.openxmlformats.org/drawingml/2006/main">
+              <a:graphicData uri="http://schemas.openxmlformats.org/drawingml/2006/picture">
+                <pic:pic xmlns:pic="http://schemas.openxmlformats.org/drawingml/2006/picture">
+                  <pic:nvPicPr>
+                    <pic:cNvPr id="1" name=""/>
+                    <pic:cNvPicPr/>
+                  </pic:nvPicPr>
+                  <pic:blipFill>
+                    <a:blip r:embed="rId71"/>
+                    <a:stretch>
+                      <a:fillRect/>
+                    </a:stretch>
+                  </pic:blipFill>
+                  <pic:spPr>
+                    <a:xfrm>
+                      <a:off x="0" y="0"/>
+                      <a:ext cx="3924848" cy="790685"/>
+                    </a:xfrm>
+                    <a:prstGeom prst="rect">
+                      <a:avLst/>
+                    </a:prstGeom>
+                  </pic:spPr>
+                </pic:pic>
+              </a:graphicData>
+            </a:graphic>
+          </wp:inline>
+        </w:drawing>
+      </w:r>
+      <w:r>
         <w:br/>
       </w:r>
       <w:r>
@@ -3312,38 +3575,448 @@
         <w:t>72. Can the user create or view an account?</w:t>
       </w:r>
       <w:r>
+        <w:t xml:space="preserve"> Yes </w:t>
+      </w:r>
+      <w:r>
+        <w:drawing>
+          <wp:inline distT="0" distB="0" distL="0" distR="0" wp14:anchorId="606CA84B" wp14:editId="5299330A">
+            <wp:extent cx="3610479" cy="828791"/>
+            <wp:effectExtent l="0" t="0" r="0" b="9525"/>
+            <wp:docPr id="67" name="Picture 67"/>
+            <wp:cNvGraphicFramePr>
+              <a:graphicFrameLocks xmlns:a="http://schemas.openxmlformats.org/drawingml/2006/main" noChangeAspect="1"/>
+            </wp:cNvGraphicFramePr>
+            <a:graphic xmlns:a="http://schemas.openxmlformats.org/drawingml/2006/main">
+              <a:graphicData uri="http://schemas.openxmlformats.org/drawingml/2006/picture">
+                <pic:pic xmlns:pic="http://schemas.openxmlformats.org/drawingml/2006/picture">
+                  <pic:nvPicPr>
+                    <pic:cNvPr id="1" name=""/>
+                    <pic:cNvPicPr/>
+                  </pic:nvPicPr>
+                  <pic:blipFill>
+                    <a:blip r:embed="rId72"/>
+                    <a:stretch>
+                      <a:fillRect/>
+                    </a:stretch>
+                  </pic:blipFill>
+                  <pic:spPr>
+                    <a:xfrm>
+                      <a:off x="0" y="0"/>
+                      <a:ext cx="3610479" cy="828791"/>
+                    </a:xfrm>
+                    <a:prstGeom prst="rect">
+                      <a:avLst/>
+                    </a:prstGeom>
+                  </pic:spPr>
+                </pic:pic>
+              </a:graphicData>
+            </a:graphic>
+          </wp:inline>
+        </w:drawing>
+      </w:r>
+      <w:r>
         <w:br/>
         <w:t>73. Can the user check the balance?</w:t>
       </w:r>
       <w:r>
+        <w:t xml:space="preserve"> Yes </w:t>
+      </w:r>
+      <w:r>
+        <w:drawing>
+          <wp:inline distT="0" distB="0" distL="0" distR="0" wp14:anchorId="66C9355A" wp14:editId="2CCAD84E">
+            <wp:extent cx="4839375" cy="342948"/>
+            <wp:effectExtent l="0" t="0" r="0" b="0"/>
+            <wp:docPr id="68" name="Picture 68"/>
+            <wp:cNvGraphicFramePr>
+              <a:graphicFrameLocks xmlns:a="http://schemas.openxmlformats.org/drawingml/2006/main" noChangeAspect="1"/>
+            </wp:cNvGraphicFramePr>
+            <a:graphic xmlns:a="http://schemas.openxmlformats.org/drawingml/2006/main">
+              <a:graphicData uri="http://schemas.openxmlformats.org/drawingml/2006/picture">
+                <pic:pic xmlns:pic="http://schemas.openxmlformats.org/drawingml/2006/picture">
+                  <pic:nvPicPr>
+                    <pic:cNvPr id="1" name=""/>
+                    <pic:cNvPicPr/>
+                  </pic:nvPicPr>
+                  <pic:blipFill>
+                    <a:blip r:embed="rId73"/>
+                    <a:stretch>
+                      <a:fillRect/>
+                    </a:stretch>
+                  </pic:blipFill>
+                  <pic:spPr>
+                    <a:xfrm>
+                      <a:off x="0" y="0"/>
+                      <a:ext cx="4839375" cy="342948"/>
+                    </a:xfrm>
+                    <a:prstGeom prst="rect">
+                      <a:avLst/>
+                    </a:prstGeom>
+                  </pic:spPr>
+                </pic:pic>
+              </a:graphicData>
+            </a:graphic>
+          </wp:inline>
+        </w:drawing>
+      </w:r>
+      <w:r>
         <w:br/>
         <w:t>74. Can the user deposit money?</w:t>
       </w:r>
       <w:r>
+        <w:t xml:space="preserve"> Yes </w:t>
+      </w:r>
+    </w:p>
+    <w:p>
+      <w:r>
+        <w:drawing>
+          <wp:inline distT="0" distB="0" distL="0" distR="0" wp14:anchorId="370ECDF9" wp14:editId="0A8B0084">
+            <wp:extent cx="2581635" cy="285790"/>
+            <wp:effectExtent l="0" t="0" r="0" b="0"/>
+            <wp:docPr id="70" name="Picture 70"/>
+            <wp:cNvGraphicFramePr>
+              <a:graphicFrameLocks xmlns:a="http://schemas.openxmlformats.org/drawingml/2006/main" noChangeAspect="1"/>
+            </wp:cNvGraphicFramePr>
+            <a:graphic xmlns:a="http://schemas.openxmlformats.org/drawingml/2006/main">
+              <a:graphicData uri="http://schemas.openxmlformats.org/drawingml/2006/picture">
+                <pic:pic xmlns:pic="http://schemas.openxmlformats.org/drawingml/2006/picture">
+                  <pic:nvPicPr>
+                    <pic:cNvPr id="1" name=""/>
+                    <pic:cNvPicPr/>
+                  </pic:nvPicPr>
+                  <pic:blipFill>
+                    <a:blip r:embed="rId74"/>
+                    <a:stretch>
+                      <a:fillRect/>
+                    </a:stretch>
+                  </pic:blipFill>
+                  <pic:spPr>
+                    <a:xfrm>
+                      <a:off x="0" y="0"/>
+                      <a:ext cx="2581635" cy="285790"/>
+                    </a:xfrm>
+                    <a:prstGeom prst="rect">
+                      <a:avLst/>
+                    </a:prstGeom>
+                  </pic:spPr>
+                </pic:pic>
+              </a:graphicData>
+            </a:graphic>
+          </wp:inline>
+        </w:drawing>
+      </w:r>
+      <w:r>
         <w:br/>
         <w:t>75. Can the user withdraw money?</w:t>
       </w:r>
       <w:r>
+        <w:t xml:space="preserve"> Yes </w:t>
+      </w:r>
+    </w:p>
+    <w:p>
+      <w:r>
+        <w:drawing>
+          <wp:inline distT="0" distB="0" distL="0" distR="0" wp14:anchorId="11E0BADA" wp14:editId="28AB46E6">
+            <wp:extent cx="2819794" cy="295316"/>
+            <wp:effectExtent l="0" t="0" r="0" b="9525"/>
+            <wp:docPr id="71" name="Picture 71"/>
+            <wp:cNvGraphicFramePr>
+              <a:graphicFrameLocks xmlns:a="http://schemas.openxmlformats.org/drawingml/2006/main" noChangeAspect="1"/>
+            </wp:cNvGraphicFramePr>
+            <a:graphic xmlns:a="http://schemas.openxmlformats.org/drawingml/2006/main">
+              <a:graphicData uri="http://schemas.openxmlformats.org/drawingml/2006/picture">
+                <pic:pic xmlns:pic="http://schemas.openxmlformats.org/drawingml/2006/picture">
+                  <pic:nvPicPr>
+                    <pic:cNvPr id="1" name=""/>
+                    <pic:cNvPicPr/>
+                  </pic:nvPicPr>
+                  <pic:blipFill>
+                    <a:blip r:embed="rId75"/>
+                    <a:stretch>
+                      <a:fillRect/>
+                    </a:stretch>
+                  </pic:blipFill>
+                  <pic:spPr>
+                    <a:xfrm>
+                      <a:off x="0" y="0"/>
+                      <a:ext cx="2819794" cy="295316"/>
+                    </a:xfrm>
+                    <a:prstGeom prst="rect">
+                      <a:avLst/>
+                    </a:prstGeom>
+                  </pic:spPr>
+                </pic:pic>
+              </a:graphicData>
+            </a:graphic>
+          </wp:inline>
+        </w:drawing>
+      </w:r>
+      <w:r>
         <w:br/>
         <w:t>76. Can the user view transaction history?</w:t>
       </w:r>
       <w:r>
+        <w:t xml:space="preserve"> Yes </w:t>
+      </w:r>
+      <w:r>
+        <w:lastRenderedPageBreak/>
+        <w:drawing>
+          <wp:inline distT="0" distB="0" distL="0" distR="0" wp14:anchorId="1A2BA921" wp14:editId="38227553">
+            <wp:extent cx="3181794" cy="790685"/>
+            <wp:effectExtent l="0" t="0" r="0" b="9525"/>
+            <wp:docPr id="74" name="Picture 74"/>
+            <wp:cNvGraphicFramePr>
+              <a:graphicFrameLocks xmlns:a="http://schemas.openxmlformats.org/drawingml/2006/main" noChangeAspect="1"/>
+            </wp:cNvGraphicFramePr>
+            <a:graphic xmlns:a="http://schemas.openxmlformats.org/drawingml/2006/main">
+              <a:graphicData uri="http://schemas.openxmlformats.org/drawingml/2006/picture">
+                <pic:pic xmlns:pic="http://schemas.openxmlformats.org/drawingml/2006/picture">
+                  <pic:nvPicPr>
+                    <pic:cNvPr id="1" name=""/>
+                    <pic:cNvPicPr/>
+                  </pic:nvPicPr>
+                  <pic:blipFill>
+                    <a:blip r:embed="rId76"/>
+                    <a:stretch>
+                      <a:fillRect/>
+                    </a:stretch>
+                  </pic:blipFill>
+                  <pic:spPr>
+                    <a:xfrm>
+                      <a:off x="0" y="0"/>
+                      <a:ext cx="3181794" cy="790685"/>
+                    </a:xfrm>
+                    <a:prstGeom prst="rect">
+                      <a:avLst/>
+                    </a:prstGeom>
+                  </pic:spPr>
+                </pic:pic>
+              </a:graphicData>
+            </a:graphic>
+          </wp:inline>
+        </w:drawing>
+      </w:r>
+      <w:r>
         <w:br/>
         <w:t>77. Can the user exit the application?</w:t>
       </w:r>
+    </w:p>
+    <w:p>
+      <w:r>
+        <w:drawing>
+          <wp:inline distT="0" distB="0" distL="0" distR="0" wp14:anchorId="7F4196F8" wp14:editId="49833378">
+            <wp:extent cx="2638793" cy="466790"/>
+            <wp:effectExtent l="0" t="0" r="9525" b="9525"/>
+            <wp:docPr id="76" name="Picture 76"/>
+            <wp:cNvGraphicFramePr>
+              <a:graphicFrameLocks xmlns:a="http://schemas.openxmlformats.org/drawingml/2006/main" noChangeAspect="1"/>
+            </wp:cNvGraphicFramePr>
+            <a:graphic xmlns:a="http://schemas.openxmlformats.org/drawingml/2006/main">
+              <a:graphicData uri="http://schemas.openxmlformats.org/drawingml/2006/picture">
+                <pic:pic xmlns:pic="http://schemas.openxmlformats.org/drawingml/2006/picture">
+                  <pic:nvPicPr>
+                    <pic:cNvPr id="1" name=""/>
+                    <pic:cNvPicPr/>
+                  </pic:nvPicPr>
+                  <pic:blipFill>
+                    <a:blip r:embed="rId77"/>
+                    <a:stretch>
+                      <a:fillRect/>
+                    </a:stretch>
+                  </pic:blipFill>
+                  <pic:spPr>
+                    <a:xfrm>
+                      <a:off x="0" y="0"/>
+                      <a:ext cx="2638793" cy="466790"/>
+                    </a:xfrm>
+                    <a:prstGeom prst="rect">
+                      <a:avLst/>
+                    </a:prstGeom>
+                  </pic:spPr>
+                </pic:pic>
+              </a:graphicData>
+            </a:graphic>
+          </wp:inline>
+        </w:drawing>
+      </w:r>
       <w:r>
         <w:br/>
         <w:t>78. Does the application handle invalid menu options?</w:t>
       </w:r>
       <w:r>
+        <w:rPr>
+          <w:noProof/>
+        </w:rPr>
+        <w:t xml:space="preserve"> </w:t>
+      </w:r>
+      <w:r>
+        <w:drawing>
+          <wp:inline distT="0" distB="0" distL="0" distR="0" wp14:anchorId="0A9F4EB6" wp14:editId="0ECA7A90">
+            <wp:extent cx="3762900" cy="571580"/>
+            <wp:effectExtent l="0" t="0" r="0" b="0"/>
+            <wp:docPr id="77" name="Picture 77"/>
+            <wp:cNvGraphicFramePr>
+              <a:graphicFrameLocks xmlns:a="http://schemas.openxmlformats.org/drawingml/2006/main" noChangeAspect="1"/>
+            </wp:cNvGraphicFramePr>
+            <a:graphic xmlns:a="http://schemas.openxmlformats.org/drawingml/2006/main">
+              <a:graphicData uri="http://schemas.openxmlformats.org/drawingml/2006/picture">
+                <pic:pic xmlns:pic="http://schemas.openxmlformats.org/drawingml/2006/picture">
+                  <pic:nvPicPr>
+                    <pic:cNvPr id="1" name=""/>
+                    <pic:cNvPicPr/>
+                  </pic:nvPicPr>
+                  <pic:blipFill>
+                    <a:blip r:embed="rId78"/>
+                    <a:stretch>
+                      <a:fillRect/>
+                    </a:stretch>
+                  </pic:blipFill>
+                  <pic:spPr>
+                    <a:xfrm>
+                      <a:off x="0" y="0"/>
+                      <a:ext cx="3762900" cy="571580"/>
+                    </a:xfrm>
+                    <a:prstGeom prst="rect">
+                      <a:avLst/>
+                    </a:prstGeom>
+                  </pic:spPr>
+                </pic:pic>
+              </a:graphicData>
+            </a:graphic>
+          </wp:inline>
+        </w:drawing>
+      </w:r>
+      <w:r>
         <w:br/>
         <w:t>79. Does the application handle invalid money values?</w:t>
       </w:r>
       <w:r>
+        <w:rPr>
+          <w:noProof/>
+        </w:rPr>
+        <w:t xml:space="preserve"> </w:t>
+      </w:r>
+      <w:r>
+        <w:drawing>
+          <wp:inline distT="0" distB="0" distL="0" distR="0" wp14:anchorId="7E6F4A2F" wp14:editId="4B5B3BCC">
+            <wp:extent cx="4715533" cy="3324689"/>
+            <wp:effectExtent l="0" t="0" r="8890" b="9525"/>
+            <wp:docPr id="78" name="Picture 78"/>
+            <wp:cNvGraphicFramePr>
+              <a:graphicFrameLocks xmlns:a="http://schemas.openxmlformats.org/drawingml/2006/main" noChangeAspect="1"/>
+            </wp:cNvGraphicFramePr>
+            <a:graphic xmlns:a="http://schemas.openxmlformats.org/drawingml/2006/main">
+              <a:graphicData uri="http://schemas.openxmlformats.org/drawingml/2006/picture">
+                <pic:pic xmlns:pic="http://schemas.openxmlformats.org/drawingml/2006/picture">
+                  <pic:nvPicPr>
+                    <pic:cNvPr id="1" name=""/>
+                    <pic:cNvPicPr/>
+                  </pic:nvPicPr>
+                  <pic:blipFill>
+                    <a:blip r:embed="rId79"/>
+                    <a:stretch>
+                      <a:fillRect/>
+                    </a:stretch>
+                  </pic:blipFill>
+                  <pic:spPr>
+                    <a:xfrm>
+                      <a:off x="0" y="0"/>
+                      <a:ext cx="4715533" cy="3324689"/>
+                    </a:xfrm>
+                    <a:prstGeom prst="rect">
+                      <a:avLst/>
+                    </a:prstGeom>
+                  </pic:spPr>
+                </pic:pic>
+              </a:graphicData>
+            </a:graphic>
+          </wp:inline>
+        </w:drawing>
+      </w:r>
+      <w:r>
         <w:br/>
         <w:t>80. Is the banking logic separated from the console display logic?</w:t>
       </w:r>
       <w:r>
+        <w:t xml:space="preserve"> Yes </w:t>
+      </w:r>
+      <w:r>
+        <w:drawing>
+          <wp:inline distT="0" distB="0" distL="0" distR="0" wp14:anchorId="39D9118A" wp14:editId="6A8625AD">
+            <wp:extent cx="5486400" cy="1682750"/>
+            <wp:effectExtent l="0" t="0" r="0" b="0"/>
+            <wp:docPr id="79" name="Picture 79"/>
+            <wp:cNvGraphicFramePr>
+              <a:graphicFrameLocks xmlns:a="http://schemas.openxmlformats.org/drawingml/2006/main" noChangeAspect="1"/>
+            </wp:cNvGraphicFramePr>
+            <a:graphic xmlns:a="http://schemas.openxmlformats.org/drawingml/2006/main">
+              <a:graphicData uri="http://schemas.openxmlformats.org/drawingml/2006/picture">
+                <pic:pic xmlns:pic="http://schemas.openxmlformats.org/drawingml/2006/picture">
+                  <pic:nvPicPr>
+                    <pic:cNvPr id="1" name=""/>
+                    <pic:cNvPicPr/>
+                  </pic:nvPicPr>
+                  <pic:blipFill>
+                    <a:blip r:embed="rId80"/>
+                    <a:stretch>
+                      <a:fillRect/>
+                    </a:stretch>
+                  </pic:blipFill>
+                  <pic:spPr>
+                    <a:xfrm>
+                      <a:off x="0" y="0"/>
+                      <a:ext cx="5486400" cy="1682750"/>
+                    </a:xfrm>
+                    <a:prstGeom prst="rect">
+                      <a:avLst/>
+                    </a:prstGeom>
+                  </pic:spPr>
+                </pic:pic>
+              </a:graphicData>
+            </a:graphic>
+          </wp:inline>
+        </w:drawing>
+      </w:r>
+      <w:r>
+        <w:lastRenderedPageBreak/>
+        <w:drawing>
+          <wp:inline distT="0" distB="0" distL="0" distR="0" wp14:anchorId="3D14D148" wp14:editId="75CA5C6B">
+            <wp:extent cx="4734586" cy="2295845"/>
+            <wp:effectExtent l="0" t="0" r="8890" b="9525"/>
+            <wp:docPr id="80" name="Picture 80"/>
+            <wp:cNvGraphicFramePr>
+              <a:graphicFrameLocks xmlns:a="http://schemas.openxmlformats.org/drawingml/2006/main" noChangeAspect="1"/>
+            </wp:cNvGraphicFramePr>
+            <a:graphic xmlns:a="http://schemas.openxmlformats.org/drawingml/2006/main">
+              <a:graphicData uri="http://schemas.openxmlformats.org/drawingml/2006/picture">
+                <pic:pic xmlns:pic="http://schemas.openxmlformats.org/drawingml/2006/picture">
+                  <pic:nvPicPr>
+                    <pic:cNvPr id="1" name=""/>
+                    <pic:cNvPicPr/>
+                  </pic:nvPicPr>
+                  <pic:blipFill>
+                    <a:blip r:embed="rId81"/>
+                    <a:stretch>
+                      <a:fillRect/>
+                    </a:stretch>
+                  </pic:blipFill>
+                  <pic:spPr>
+                    <a:xfrm>
+                      <a:off x="0" y="0"/>
+                      <a:ext cx="4734586" cy="2295845"/>
+                    </a:xfrm>
+                    <a:prstGeom prst="rect">
+                      <a:avLst/>
+                    </a:prstGeom>
+                  </pic:spPr>
+                </pic:pic>
+              </a:graphicData>
+            </a:graphic>
+          </wp:inline>
+        </w:drawing>
+      </w:r>
+      <w:bookmarkStart w:id="0" w:name="_GoBack"/>
+      <w:bookmarkEnd w:id="0"/>
+      <w:r>
         <w:br/>
       </w:r>
       <w:r>
@@ -3387,9 +4060,6 @@
       </w:r>
       <w:r>
         <w:br/>
-      </w:r>
-      <w:r>
-        <w:lastRenderedPageBreak/>
         <w:t>2. Store account holder, account number, and balance.</w:t>
       </w:r>
       <w:r>
@@ -15380,7 +16050,7 @@
 </file>
 
 <file path=customXml/itemProps1.xml><?xml version="1.0" encoding="utf-8"?>
-<ds:datastoreItem xmlns:ds="http://schemas.openxmlformats.org/officeDocument/2006/customXml" ds:itemID="{E3559C07-AD55-4516-9D91-75B4430C0998}">
+<ds:datastoreItem xmlns:ds="http://schemas.openxmlformats.org/officeDocument/2006/customXml" ds:itemID="{499D75C1-F384-4A9B-9039-687C475C1331}">
   <ds:schemaRefs>
     <ds:schemaRef ds:uri="http://schemas.openxmlformats.org/officeDocument/2006/bibliography"/>
   </ds:schemaRefs>

</xml_diff>